<commit_message>
fix: Cap nhat dap an chuan Cau 34 Bai 1 (Dang Cong San la dap an ve 1, tang lop nhan dan la phuong an gay nhieu)
</commit_message>
<xml_diff>
--- a/CHỦ NGHĨA XH-KH.docx
+++ b/CHỦ NGHĨA XH-KH.docx
@@ -5491,7 +5491,7 @@
           <w:szCs w:val="32"/>
           <w:lang w:val="vi-VN"/>
         </w:rPr>
-        <w:t xml:space="preserve">Đảng Cộng Sản </w:t>
+        <w:t>tầng lớp nhân dân</w:t>
       </w:r>
     </w:p>
     <w:p>
@@ -5512,17 +5512,31 @@
         </w:rPr>
         <w:t xml:space="preserve">1, Giai cấp công nhân Việt Nam là lực lượng nòng cốt của </w:t>
       </w:r>
-      <w:r>
-        <w:rPr>
-          <w:rFonts w:ascii="Times New Roman" w:hAnsi="Times New Roman" w:cs="Times New Roman"/>
-          <w:b/>
-          <w:bCs/>
-          <w:color w:val="EE0000"/>
-          <w:sz w:val="32"/>
-          <w:szCs w:val="32"/>
-          <w:lang w:val="vi-VN"/>
-        </w:rPr>
-        <w:t xml:space="preserve">tầng lớp nhân dân </w:t>
+      <w:bookmarkStart w:id="0" w:name="_GoBack"/>
+      <w:bookmarkEnd w:id="0"/>
+      <w:r>
+        <w:rPr>
+          <w:rFonts w:ascii="Times New Roman" w:hAnsi="Times New Roman" w:cs="Times New Roman"/>
+          <w:b/>
+          <w:bCs/>
+          <w:color w:val="EE0000"/>
+          <w:sz w:val="32"/>
+          <w:szCs w:val="32"/>
+          <w:lang w:val="vi-VN"/>
+        </w:rPr>
+        <w:t>Đảng Cộng Sản</w:t>
+      </w:r>
+      <w:r>
+        <w:rPr>
+          <w:rFonts w:ascii="Times New Roman" w:hAnsi="Times New Roman" w:cs="Times New Roman"/>
+          <w:b/>
+          <w:bCs/>
+          <w:color w:val="EE0000"/>
+          <w:sz w:val="32"/>
+          <w:szCs w:val="32"/>
+          <w:lang w:val="vi-VN"/>
+        </w:rPr>
+        <w:t xml:space="preserve"> </w:t>
       </w:r>
       <w:r>
         <w:rPr>
@@ -31151,8 +31165,6 @@
           <w:szCs w:val="32"/>
         </w:rPr>
       </w:pPr>
-      <w:bookmarkStart w:id="0" w:name="_GoBack"/>
-      <w:bookmarkEnd w:id="0"/>
       <w:r>
         <w:rPr>
           <w:rFonts w:ascii="Times New Roman" w:hAnsi="Times New Roman" w:cs="Times New Roman"/>
@@ -40507,7 +40519,7 @@
 </file>
 
 <file path=customXml/itemProps1.xml><?xml version="1.0" encoding="utf-8"?>
-<ds:datastoreItem xmlns:ds="http://schemas.openxmlformats.org/officeDocument/2006/customXml" ds:itemID="{A30F1359-80F6-4348-81B4-34914EA6125C}">
+<ds:datastoreItem xmlns:ds="http://schemas.openxmlformats.org/officeDocument/2006/customXml" ds:itemID="{5D022970-DE7F-444B-801B-E73573A40485}">
   <ds:schemaRefs>
     <ds:schemaRef ds:uri="http://schemas.openxmlformats.org/officeDocument/2006/bibliography"/>
   </ds:schemaRefs>

</xml_diff>

<commit_message>
fix: Chuan hoa so luong cau hoi tung Bai 1-6 va Kiem Tra TX khop 100% voi tung phan trong file docx
</commit_message>
<xml_diff>
--- a/CHỦ NGHĨA XH-KH.docx
+++ b/CHỦ NGHĨA XH-KH.docx
@@ -5512,8 +5512,6 @@
         </w:rPr>
         <w:t xml:space="preserve">1, Giai cấp công nhân Việt Nam là lực lượng nòng cốt của </w:t>
       </w:r>
-      <w:bookmarkStart w:id="0" w:name="_GoBack"/>
-      <w:bookmarkEnd w:id="0"/>
       <w:r>
         <w:rPr>
           <w:rFonts w:ascii="Times New Roman" w:hAnsi="Times New Roman" w:cs="Times New Roman"/>
@@ -6958,38 +6956,17 @@
       <w:pPr>
         <w:rPr>
           <w:rFonts w:ascii="Times New Roman" w:hAnsi="Times New Roman" w:cs="Times New Roman"/>
-          <w:color w:val="EE0000"/>
-          <w:sz w:val="32"/>
-          <w:szCs w:val="32"/>
-        </w:rPr>
-      </w:pPr>
-      <w:r>
-        <w:rPr>
-          <w:rFonts w:ascii="Times New Roman" w:hAnsi="Times New Roman" w:cs="Times New Roman"/>
-          <w:color w:val="EE0000"/>
-          <w:sz w:val="32"/>
-          <w:szCs w:val="32"/>
-        </w:rPr>
-        <w:t xml:space="preserve">A. Bắt đầu từ thời kỳ quá độ và hoàn thiện ở </w:t>
-      </w:r>
-      <w:r>
-        <w:rPr>
-          <w:rFonts w:ascii="Times New Roman" w:hAnsi="Times New Roman" w:cs="Times New Roman"/>
-          <w:color w:val="EE0000"/>
-          <w:sz w:val="32"/>
-          <w:szCs w:val="32"/>
-          <w:u w:val="single"/>
-        </w:rPr>
-        <w:t>giai đoạn thấp</w:t>
-      </w:r>
-      <w:r>
-        <w:rPr>
-          <w:rFonts w:ascii="Times New Roman" w:hAnsi="Times New Roman" w:cs="Times New Roman"/>
-          <w:color w:val="EE0000"/>
-          <w:sz w:val="32"/>
-          <w:szCs w:val="32"/>
-        </w:rPr>
-        <w:t xml:space="preserve"> của xã hội cộng sản.</w:t>
+          <w:sz w:val="32"/>
+          <w:szCs w:val="32"/>
+        </w:rPr>
+      </w:pPr>
+      <w:r>
+        <w:rPr>
+          <w:rFonts w:ascii="Times New Roman" w:hAnsi="Times New Roman" w:cs="Times New Roman"/>
+          <w:sz w:val="32"/>
+          <w:szCs w:val="32"/>
+        </w:rPr>
+        <w:t>A. Bắt đầu từ thời kỳ quá độ và hoàn thiện ở giai đoạn thấp của xã hội cộng sản.</w:t>
       </w:r>
     </w:p>
     <w:p>
@@ -7030,18 +7007,22 @@
       <w:pPr>
         <w:rPr>
           <w:rFonts w:ascii="Times New Roman" w:hAnsi="Times New Roman" w:cs="Times New Roman"/>
-          <w:sz w:val="32"/>
-          <w:szCs w:val="32"/>
-        </w:rPr>
-      </w:pPr>
-      <w:r>
-        <w:rPr>
-          <w:rFonts w:ascii="Times New Roman" w:hAnsi="Times New Roman" w:cs="Times New Roman"/>
+          <w:color w:val="FF0000"/>
+          <w:sz w:val="32"/>
+          <w:szCs w:val="32"/>
+        </w:rPr>
+      </w:pPr>
+      <w:r>
+        <w:rPr>
+          <w:rFonts w:ascii="Times New Roman" w:hAnsi="Times New Roman" w:cs="Times New Roman"/>
+          <w:color w:val="FF0000"/>
           <w:sz w:val="32"/>
           <w:szCs w:val="32"/>
         </w:rPr>
         <w:t>D. Bắt đầu từ thời kỳ quá độ cho đến khi xây dựng xong giai đoạn cao của xã hội cộng sản.</w:t>
       </w:r>
+      <w:bookmarkStart w:id="0" w:name="_GoBack"/>
+      <w:bookmarkEnd w:id="0"/>
     </w:p>
     <w:p>
       <w:pPr>
@@ -40519,7 +40500,7 @@
 </file>
 
 <file path=customXml/itemProps1.xml><?xml version="1.0" encoding="utf-8"?>
-<ds:datastoreItem xmlns:ds="http://schemas.openxmlformats.org/officeDocument/2006/customXml" ds:itemID="{5D022970-DE7F-444B-801B-E73573A40485}">
+<ds:datastoreItem xmlns:ds="http://schemas.openxmlformats.org/officeDocument/2006/customXml" ds:itemID="{57C9F5DD-F0F7-4B3B-8D88-B3D7B555DE8D}">
   <ds:schemaRefs>
     <ds:schemaRef ds:uri="http://schemas.openxmlformats.org/officeDocument/2006/bibliography"/>
   </ds:schemaRefs>

</xml_diff>